<commit_message>
fix(ui): stabilize acceptance and enforce StudyGuide touch targets
</commit_message>
<xml_diff>
--- a/docs/ui-acceptance-3.33.0/JackYun主站UI验收与合并说明3.33.0.docx
+++ b/docs/ui-acceptance-3.33.0/JackYun主站UI验收与合并说明3.33.0.docx
@@ -35,7 +35,7 @@
     </w:p>
     <w:p>
       <w:r>
-        <w:t>本次交付统一主站基础控件、工具箱、导航、设置、学习页面常用操作及在用 iframe 的交互规范，保留 JackYun 蓝色和浅色、灰色、深色三主题。生产构建与源码逐文件核对，避免验收旧预览。验收发现并修复了语言 Provider 重挂载、导航统计存储异常和缓存计时 iframe 初始化竞态三个真实问题。</w:t>
+        <w:t>本次交付统一主站基础控件、工具箱、导航、设置、学习页面常用操作及在用 iframe 的交互规范，保留 JackYun 蓝色和浅色、灰色、深色三主题。生产构建与源码逐文件核对，避免验收旧预览。验收发现并修复了语言 Provider 重挂载、导航统计存储异常、缓存计时 iframe 初始化竞态，以及 StudyGuide 输入框依赖字体高度而未达到 44px 触控目标的问题。</w:t>
       </w:r>
     </w:p>
     <w:p>
@@ -100,6 +100,7 @@
       <w:tr>
         <w:trPr>
           <w:tblHeader/>
+          <w:cantSplit/>
         </w:trPr>
         <w:tc>
           <w:tcPr>
@@ -235,6 +236,9 @@
         </w:tc>
       </w:tr>
       <w:tr>
+        <w:trPr>
+          <w:cantSplit/>
+        </w:trPr>
         <w:tc>
           <w:tcPr>
             <w:tcW w:type="dxa" w:w="1587"/>
@@ -361,6 +365,9 @@
         </w:tc>
       </w:tr>
       <w:tr>
+        <w:trPr>
+          <w:cantSplit/>
+        </w:trPr>
         <w:tc>
           <w:tcPr>
             <w:tcW w:type="dxa" w:w="1587"/>
@@ -487,6 +494,9 @@
         </w:tc>
       </w:tr>
       <w:tr>
+        <w:trPr>
+          <w:cantSplit/>
+        </w:trPr>
         <w:tc>
           <w:tcPr>
             <w:tcW w:type="dxa" w:w="1587"/>
@@ -613,6 +623,9 @@
         </w:tc>
       </w:tr>
       <w:tr>
+        <w:trPr>
+          <w:cantSplit/>
+        </w:trPr>
         <w:tc>
           <w:tcPr>
             <w:tcW w:type="dxa" w:w="1587"/>
@@ -739,6 +752,9 @@
         </w:tc>
       </w:tr>
       <w:tr>
+        <w:trPr>
+          <w:cantSplit/>
+        </w:trPr>
         <w:tc>
           <w:tcPr>
             <w:tcW w:type="dxa" w:w="1587"/>
@@ -865,6 +881,9 @@
         </w:tc>
       </w:tr>
       <w:tr>
+        <w:trPr>
+          <w:cantSplit/>
+        </w:trPr>
         <w:tc>
           <w:tcPr>
             <w:tcW w:type="dxa" w:w="1587"/>
@@ -990,6 +1009,264 @@
           </w:p>
         </w:tc>
       </w:tr>
+      <w:tr>
+        <w:trPr>
+          <w:cantSplit/>
+        </w:trPr>
+        <w:tc>
+          <w:tcPr>
+            <w:tcW w:type="dxa" w:w="1587"/>
+            <w:vAlign w:val="center"/>
+            <w:tcMar>
+              <w:top w:w="95" w:type="dxa"/>
+              <w:bottom w:w="95" w:type="dxa"/>
+              <w:left w:w="95" w:type="dxa"/>
+              <w:right w:w="95" w:type="dxa"/>
+            </w:tcMar>
+            <w:shd w:fill="FFFFFF"/>
+            <w:tcBorders>
+              <w:top w:val="single" w:sz="4" w:color="D9D9D9"/>
+              <w:left w:val="single" w:sz="4" w:color="D9D9D9"/>
+              <w:bottom w:val="single" w:sz="4" w:color="D9D9D9"/>
+              <w:right w:val="single" w:sz="4" w:color="D9D9D9"/>
+            </w:tcBorders>
+          </w:tcPr>
+          <w:p>
+            <w:pPr>
+              <w:keepNext w:val="0"/>
+              <w:spacing w:after="40" w:line="269" w:lineRule="auto"/>
+            </w:pPr>
+            <w:r>
+              <w:rPr>
+                <w:sz w:val="18"/>
+              </w:rPr>
+              <w:t>P1</w:t>
+            </w:r>
+          </w:p>
+        </w:tc>
+        <w:tc>
+          <w:tcPr>
+            <w:tcW w:type="dxa" w:w="2835"/>
+            <w:vAlign w:val="center"/>
+            <w:tcMar>
+              <w:top w:w="95" w:type="dxa"/>
+              <w:bottom w:w="95" w:type="dxa"/>
+              <w:left w:w="95" w:type="dxa"/>
+              <w:right w:w="95" w:type="dxa"/>
+            </w:tcMar>
+            <w:shd w:fill="FFFFFF"/>
+            <w:tcBorders>
+              <w:top w:val="single" w:sz="4" w:color="D9D9D9"/>
+              <w:left w:val="single" w:sz="4" w:color="D9D9D9"/>
+              <w:bottom w:val="single" w:sz="4" w:color="D9D9D9"/>
+              <w:right w:val="single" w:sz="4" w:color="D9D9D9"/>
+            </w:tcBorders>
+          </w:tcPr>
+          <w:p>
+            <w:pPr>
+              <w:keepNext w:val="0"/>
+              <w:spacing w:after="40" w:line="269" w:lineRule="auto"/>
+            </w:pPr>
+            <w:r>
+              <w:rPr>
+                <w:sz w:val="18"/>
+              </w:rPr>
+              <w:t>Linux 回归发现 StudyGuide 任务助手输入框依赖字体默认行高，实际高度不足 44px</w:t>
+            </w:r>
+          </w:p>
+        </w:tc>
+        <w:tc>
+          <w:tcPr>
+            <w:tcW w:type="dxa" w:w="2324"/>
+            <w:vAlign w:val="center"/>
+            <w:tcMar>
+              <w:top w:w="95" w:type="dxa"/>
+              <w:bottom w:w="95" w:type="dxa"/>
+              <w:left w:w="95" w:type="dxa"/>
+              <w:right w:w="95" w:type="dxa"/>
+            </w:tcMar>
+            <w:shd w:fill="FFFFFF"/>
+            <w:tcBorders>
+              <w:top w:val="single" w:sz="4" w:color="D9D9D9"/>
+              <w:left w:val="single" w:sz="4" w:color="D9D9D9"/>
+              <w:bottom w:val="single" w:sz="4" w:color="D9D9D9"/>
+              <w:right w:val="single" w:sz="4" w:color="D9D9D9"/>
+            </w:tcBorders>
+          </w:tcPr>
+          <w:p>
+            <w:pPr>
+              <w:keepNext w:val="0"/>
+              <w:spacing w:after="40" w:line="269" w:lineRule="auto"/>
+            </w:pPr>
+            <w:r>
+              <w:rPr>
+                <w:sz w:val="18"/>
+              </w:rPr>
+              <w:t>在现有 .tool-field 输入、选择和文本区域规则明确 min-height: 44px</w:t>
+            </w:r>
+          </w:p>
+        </w:tc>
+        <w:tc>
+          <w:tcPr>
+            <w:tcW w:type="dxa" w:w="2835"/>
+            <w:vAlign w:val="center"/>
+            <w:tcMar>
+              <w:top w:w="95" w:type="dxa"/>
+              <w:bottom w:w="95" w:type="dxa"/>
+              <w:left w:w="95" w:type="dxa"/>
+              <w:right w:w="95" w:type="dxa"/>
+            </w:tcMar>
+            <w:shd w:fill="FFFFFF"/>
+            <w:tcBorders>
+              <w:top w:val="single" w:sz="4" w:color="D9D9D9"/>
+              <w:left w:val="single" w:sz="4" w:color="D9D9D9"/>
+              <w:bottom w:val="single" w:sz="4" w:color="D9D9D9"/>
+              <w:right w:val="single" w:sz="4" w:color="D9D9D9"/>
+            </w:tcBorders>
+          </w:tcPr>
+          <w:p>
+            <w:pPr>
+              <w:keepNext w:val="0"/>
+              <w:spacing w:after="40" w:line="269" w:lineRule="auto"/>
+            </w:pPr>
+            <w:r>
+              <w:rPr>
+                <w:sz w:val="18"/>
+              </w:rPr>
+              <w:t>生产预览更新静态文件后，任务草稿、移动深链、实际边框高度和 16px 字号回归通过</w:t>
+            </w:r>
+          </w:p>
+        </w:tc>
+      </w:tr>
+      <w:tr>
+        <w:trPr>
+          <w:cantSplit/>
+        </w:trPr>
+        <w:tc>
+          <w:tcPr>
+            <w:tcW w:type="dxa" w:w="1587"/>
+            <w:vAlign w:val="center"/>
+            <w:tcMar>
+              <w:top w:w="95" w:type="dxa"/>
+              <w:bottom w:w="95" w:type="dxa"/>
+              <w:left w:w="95" w:type="dxa"/>
+              <w:right w:w="95" w:type="dxa"/>
+            </w:tcMar>
+            <w:shd w:fill="F3F6FA"/>
+            <w:tcBorders>
+              <w:top w:val="single" w:sz="4" w:color="D9D9D9"/>
+              <w:left w:val="single" w:sz="4" w:color="D9D9D9"/>
+              <w:bottom w:val="single" w:sz="4" w:color="D9D9D9"/>
+              <w:right w:val="single" w:sz="4" w:color="D9D9D9"/>
+            </w:tcBorders>
+          </w:tcPr>
+          <w:p>
+            <w:pPr>
+              <w:keepNext w:val="0"/>
+              <w:spacing w:after="40" w:line="269" w:lineRule="auto"/>
+            </w:pPr>
+            <w:r>
+              <w:rPr>
+                <w:sz w:val="18"/>
+              </w:rPr>
+              <w:t>P1</w:t>
+            </w:r>
+          </w:p>
+        </w:tc>
+        <w:tc>
+          <w:tcPr>
+            <w:tcW w:type="dxa" w:w="2835"/>
+            <w:vAlign w:val="center"/>
+            <w:tcMar>
+              <w:top w:w="95" w:type="dxa"/>
+              <w:bottom w:w="95" w:type="dxa"/>
+              <w:left w:w="95" w:type="dxa"/>
+              <w:right w:w="95" w:type="dxa"/>
+            </w:tcMar>
+            <w:shd w:fill="F3F6FA"/>
+            <w:tcBorders>
+              <w:top w:val="single" w:sz="4" w:color="D9D9D9"/>
+              <w:left w:val="single" w:sz="4" w:color="D9D9D9"/>
+              <w:bottom w:val="single" w:sz="4" w:color="D9D9D9"/>
+              <w:right w:val="single" w:sz="4" w:color="D9D9D9"/>
+            </w:tcBorders>
+          </w:tcPr>
+          <w:p>
+            <w:pPr>
+              <w:keepNext w:val="0"/>
+              <w:spacing w:after="40" w:line="269" w:lineRule="auto"/>
+            </w:pPr>
+            <w:r>
+              <w:rPr>
+                <w:sz w:val="18"/>
+              </w:rPr>
+              <w:t>两项日期测试隐含上海时区；设置测试撤销拦截时仍有延迟 handler；旧页测试等待后台 JSONP 完成导致误超时</w:t>
+            </w:r>
+          </w:p>
+        </w:tc>
+        <w:tc>
+          <w:tcPr>
+            <w:tcW w:type="dxa" w:w="2324"/>
+            <w:vAlign w:val="center"/>
+            <w:tcMar>
+              <w:top w:w="95" w:type="dxa"/>
+              <w:bottom w:w="95" w:type="dxa"/>
+              <w:left w:w="95" w:type="dxa"/>
+              <w:right w:w="95" w:type="dxa"/>
+            </w:tcMar>
+            <w:shd w:fill="F3F6FA"/>
+            <w:tcBorders>
+              <w:top w:val="single" w:sz="4" w:color="D9D9D9"/>
+              <w:left w:val="single" w:sz="4" w:color="D9D9D9"/>
+              <w:bottom w:val="single" w:sz="4" w:color="D9D9D9"/>
+              <w:right w:val="single" w:sz="4" w:color="D9D9D9"/>
+            </w:tcBorders>
+          </w:tcPr>
+          <w:p>
+            <w:pPr>
+              <w:keepNext w:val="0"/>
+              <w:spacing w:after="40" w:line="269" w:lineRule="auto"/>
+            </w:pPr>
+            <w:r>
+              <w:rPr>
+                <w:sz w:val="18"/>
+              </w:rPr>
+              <w:t>测试构造明确的本地日期；unrouteAll 等待 handler；等待 DOM 完成后验证主题语言桥，字体使用本地回退</w:t>
+            </w:r>
+          </w:p>
+        </w:tc>
+        <w:tc>
+          <w:tcPr>
+            <w:tcW w:type="dxa" w:w="2835"/>
+            <w:vAlign w:val="center"/>
+            <w:tcMar>
+              <w:top w:w="95" w:type="dxa"/>
+              <w:bottom w:w="95" w:type="dxa"/>
+              <w:left w:w="95" w:type="dxa"/>
+              <w:right w:w="95" w:type="dxa"/>
+            </w:tcMar>
+            <w:shd w:fill="F3F6FA"/>
+            <w:tcBorders>
+              <w:top w:val="single" w:sz="4" w:color="D9D9D9"/>
+              <w:left w:val="single" w:sz="4" w:color="D9D9D9"/>
+              <w:bottom w:val="single" w:sz="4" w:color="D9D9D9"/>
+              <w:right w:val="single" w:sz="4" w:color="D9D9D9"/>
+            </w:tcBorders>
+          </w:tcPr>
+          <w:p>
+            <w:pPr>
+              <w:keepNext w:val="0"/>
+              <w:spacing w:after="40" w:line="269" w:lineRule="auto"/>
+            </w:pPr>
+            <w:r>
+              <w:rPr>
+                <w:sz w:val="18"/>
+              </w:rPr>
+              <w:t>UTC 全量 797/797，上海和 UTC 各 15 项日期测试；设置 16 项、19 个旧入口双视口复验通过；最终远程 CI 仍需完整重跑</w:t>
+            </w:r>
+          </w:p>
+        </w:tc>
+      </w:tr>
     </w:tbl>
     <w:p>
       <w:pPr>
@@ -1024,6 +1301,7 @@
       <w:tr>
         <w:trPr>
           <w:tblHeader/>
+          <w:cantSplit/>
         </w:trPr>
         <w:tc>
           <w:tcPr>
@@ -1126,6 +1404,9 @@
         </w:tc>
       </w:tr>
       <w:tr>
+        <w:trPr>
+          <w:cantSplit/>
+        </w:trPr>
         <w:tc>
           <w:tcPr>
             <w:tcW w:type="dxa" w:w="1701"/>
@@ -1221,6 +1502,9 @@
         </w:tc>
       </w:tr>
       <w:tr>
+        <w:trPr>
+          <w:cantSplit/>
+        </w:trPr>
         <w:tc>
           <w:tcPr>
             <w:tcW w:type="dxa" w:w="1701"/>
@@ -1316,6 +1600,9 @@
         </w:tc>
       </w:tr>
       <w:tr>
+        <w:trPr>
+          <w:cantSplit/>
+        </w:trPr>
         <w:tc>
           <w:tcPr>
             <w:tcW w:type="dxa" w:w="1701"/>
@@ -1411,6 +1698,9 @@
         </w:tc>
       </w:tr>
       <w:tr>
+        <w:trPr>
+          <w:cantSplit/>
+        </w:trPr>
         <w:tc>
           <w:tcPr>
             <w:tcW w:type="dxa" w:w="1701"/>
@@ -1506,6 +1796,9 @@
         </w:tc>
       </w:tr>
       <w:tr>
+        <w:trPr>
+          <w:cantSplit/>
+        </w:trPr>
         <w:tc>
           <w:tcPr>
             <w:tcW w:type="dxa" w:w="1701"/>
@@ -1601,6 +1894,9 @@
         </w:tc>
       </w:tr>
       <w:tr>
+        <w:trPr>
+          <w:cantSplit/>
+        </w:trPr>
         <w:tc>
           <w:tcPr>
             <w:tcW w:type="dxa" w:w="1701"/>
@@ -1696,6 +1992,9 @@
         </w:tc>
       </w:tr>
       <w:tr>
+        <w:trPr>
+          <w:cantSplit/>
+        </w:trPr>
         <w:tc>
           <w:tcPr>
             <w:tcW w:type="dxa" w:w="1701"/>
@@ -1791,6 +2090,9 @@
         </w:tc>
       </w:tr>
       <w:tr>
+        <w:trPr>
+          <w:cantSplit/>
+        </w:trPr>
         <w:tc>
           <w:tcPr>
             <w:tcW w:type="dxa" w:w="1701"/>
@@ -1886,6 +2188,9 @@
         </w:tc>
       </w:tr>
       <w:tr>
+        <w:trPr>
+          <w:cantSplit/>
+        </w:trPr>
         <w:tc>
           <w:tcPr>
             <w:tcW w:type="dxa" w:w="1701"/>
@@ -1981,6 +2286,9 @@
         </w:tc>
       </w:tr>
       <w:tr>
+        <w:trPr>
+          <w:cantSplit/>
+        </w:trPr>
         <w:tc>
           <w:tcPr>
             <w:tcW w:type="dxa" w:w="1701"/>
@@ -2142,6 +2450,7 @@
       <w:tr>
         <w:trPr>
           <w:tblHeader/>
+          <w:cantSplit/>
         </w:trPr>
         <w:tc>
           <w:tcPr>
@@ -2244,6 +2553,9 @@
         </w:tc>
       </w:tr>
       <w:tr>
+        <w:trPr>
+          <w:cantSplit/>
+        </w:trPr>
         <w:tc>
           <w:tcPr>
             <w:tcW w:type="dxa" w:w="1701"/>
@@ -2339,6 +2651,9 @@
         </w:tc>
       </w:tr>
       <w:tr>
+        <w:trPr>
+          <w:cantSplit/>
+        </w:trPr>
         <w:tc>
           <w:tcPr>
             <w:tcW w:type="dxa" w:w="1701"/>
@@ -2434,6 +2749,9 @@
         </w:tc>
       </w:tr>
       <w:tr>
+        <w:trPr>
+          <w:cantSplit/>
+        </w:trPr>
         <w:tc>
           <w:tcPr>
             <w:tcW w:type="dxa" w:w="1701"/>
@@ -2529,6 +2847,9 @@
         </w:tc>
       </w:tr>
       <w:tr>
+        <w:trPr>
+          <w:cantSplit/>
+        </w:trPr>
         <w:tc>
           <w:tcPr>
             <w:tcW w:type="dxa" w:w="1701"/>
@@ -2624,6 +2945,9 @@
         </w:tc>
       </w:tr>
       <w:tr>
+        <w:trPr>
+          <w:cantSplit/>
+        </w:trPr>
         <w:tc>
           <w:tcPr>
             <w:tcW w:type="dxa" w:w="1701"/>
@@ -2719,6 +3043,9 @@
         </w:tc>
       </w:tr>
       <w:tr>
+        <w:trPr>
+          <w:cantSplit/>
+        </w:trPr>
         <w:tc>
           <w:tcPr>
             <w:tcW w:type="dxa" w:w="1701"/>
@@ -2814,6 +3141,9 @@
         </w:tc>
       </w:tr>
       <w:tr>
+        <w:trPr>
+          <w:cantSplit/>
+        </w:trPr>
         <w:tc>
           <w:tcPr>
             <w:tcW w:type="dxa" w:w="1701"/>
@@ -2922,6 +3252,11 @@
     <w:p>
       <w:r>
         <w:t>复现时先启动 tests/fixtures/ui-backend.mjs 于 127.0.0.1:54329，再使用 NEXT_PUBLIC_SUPABASE_URL=http://127.0.0.1:54329 和非真实占位 key 构建、运行应用。设定 JACKYUN_TEST_URL 为该 loopback 服务，然后执行 node scripts/verify-ui.mjs。若使用独立快照，JACKYUN_BUILD_DIR 必须指向被测服务的实际 .next。JACKYUN_BROWSER_CHANNEL 本机可选 msedge，CI 为 chromium。所有浏览器写操作只作用于本机 fixture 或隔离浏览器存储。</w:t>
+      </w:r>
+    </w:p>
+    <w:p>
+      <w:r>
+        <w:t>远程首轮浏览器运行 28/31 通过，发现上述设置拦截竞争、旧页后台请求等待和 StudyGuide 触控高度问题，均已定向修复并在本机复验。新增 CUE 真实学习会话中的全屏帮助覆盖、关闭及焦点恢复回归通过；该场景现有 Portal 正常，未因此修改层级代码。此处记录问题发现过程；最终合并必须以最终提交对应的全量 CI 成功为准。</w:t>
       </w:r>
     </w:p>
     <w:p>

</xml_diff>